<commit_message>
Add PDF version of documentation
</commit_message>
<xml_diff>
--- a/Actitivity-Lab-3-Part-3_Documentation.docx
+++ b/Actitivity-Lab-3-Part-3_Documentation.docx
@@ -298,7 +298,21 @@
         <w:rPr>
           <w:rFonts w:ascii="Courier New" w:hAnsi="Courier New" w:cs="Courier New"/>
         </w:rPr>
-        <w:t>The users array is reset to empty and the IDs start at 1 again, so every account is gone.</w:t>
+        <w:t xml:space="preserve">The </w:t>
+      </w:r>
+      <w:proofErr w:type="gramStart"/>
+      <w:r>
+        <w:rPr>
+          <w:rFonts w:ascii="Courier New" w:hAnsi="Courier New" w:cs="Courier New"/>
+        </w:rPr>
+        <w:t>users</w:t>
+      </w:r>
+      <w:proofErr w:type="gramEnd"/>
+      <w:r>
+        <w:rPr>
+          <w:rFonts w:ascii="Courier New" w:hAnsi="Courier New" w:cs="Courier New"/>
+        </w:rPr>
+        <w:t xml:space="preserve"> array is reset to empty and the IDs start at 1 again, so every account is gone.</w:t>
       </w:r>
     </w:p>
     <w:p>
@@ -641,22 +655,22 @@
     </w:p>
     <w:p>
       <w:pPr>
-        <w:keepNext/>
-        <w:pBdr>
-          <w:bottom w:val="single" w:sz="6" w:space="2" w:color="999999"/>
-        </w:pBdr>
-        <w:spacing w:before="300" w:after="120"/>
-        <w:rPr>
-          <w:rFonts w:ascii="Courier New" w:hAnsi="Courier New" w:cs="Courier New"/>
-        </w:rPr>
-      </w:pPr>
-      <w:r>
+        <w:pStyle w:val="ListParagraph"/>
         <w:rPr>
           <w:rFonts w:ascii="Courier New" w:hAnsi="Courier New" w:cs="Courier New"/>
           <w:b/>
           <w:bCs/>
-          <w:sz w:val="26"/>
-          <w:szCs w:val="26"/>
+          <w:sz w:val="28"/>
+          <w:szCs w:val="28"/>
+        </w:rPr>
+      </w:pPr>
+      <w:r>
+        <w:rPr>
+          <w:rFonts w:ascii="Courier New" w:hAnsi="Courier New" w:cs="Courier New"/>
+          <w:b/>
+          <w:bCs/>
+          <w:sz w:val="28"/>
+          <w:szCs w:val="28"/>
         </w:rPr>
         <w:lastRenderedPageBreak/>
         <w:t>VI. Laboratory Tasks</w:t>
@@ -709,7 +723,7 @@
           <w:noProof/>
         </w:rPr>
         <w:drawing>
-          <wp:inline distT="0" distB="0" distL="0" distR="0" wp14:anchorId="0B1D7277" wp14:editId="43AF4F40">
+          <wp:inline distT="0" distB="0" distL="0" distR="0" wp14:anchorId="0B1D7277" wp14:editId="4FF2DEC8">
             <wp:extent cx="5731510" cy="1449705"/>
             <wp:effectExtent l="0" t="0" r="2540" b="0"/>
             <wp:docPr id="1540449042" name="Picture 2"/>
@@ -844,15 +858,6 @@
         </w:rPr>
         <w:br w:type="page"/>
       </w:r>
-    </w:p>
-    <w:p>
-      <w:pPr>
-        <w:keepNext/>
-        <w:spacing w:after="100"/>
-        <w:rPr>
-          <w:rFonts w:ascii="Courier New" w:hAnsi="Courier New" w:cs="Courier New"/>
-        </w:rPr>
-      </w:pPr>
       <w:r>
         <w:rPr>
           <w:rFonts w:ascii="Courier New" w:hAnsi="Courier New" w:cs="Courier New"/>
@@ -943,12 +948,6 @@
         <w:gridCol w:w="9310"/>
       </w:tblGrid>
       <w:tr>
-        <w:tblPrEx>
-          <w:tblCellMar>
-            <w:top w:w="0" w:type="dxa"/>
-            <w:bottom w:w="0" w:type="dxa"/>
-          </w:tblCellMar>
-        </w:tblPrEx>
         <w:trPr>
           <w:cantSplit/>
         </w:trPr>
@@ -1008,12 +1007,6 @@
         </w:tc>
       </w:tr>
       <w:tr>
-        <w:tblPrEx>
-          <w:tblCellMar>
-            <w:top w:w="0" w:type="dxa"/>
-            <w:bottom w:w="0" w:type="dxa"/>
-          </w:tblCellMar>
-        </w:tblPrEx>
         <w:trPr>
           <w:cantSplit/>
         </w:trPr>
@@ -1081,12 +1074,6 @@
         </w:tc>
       </w:tr>
       <w:tr>
-        <w:tblPrEx>
-          <w:tblCellMar>
-            <w:top w:w="0" w:type="dxa"/>
-            <w:bottom w:w="0" w:type="dxa"/>
-          </w:tblCellMar>
-        </w:tblPrEx>
         <w:trPr>
           <w:cantSplit/>
         </w:trPr>
@@ -1154,12 +1141,6 @@
         </w:tc>
       </w:tr>
       <w:tr>
-        <w:tblPrEx>
-          <w:tblCellMar>
-            <w:top w:w="0" w:type="dxa"/>
-            <w:bottom w:w="0" w:type="dxa"/>
-          </w:tblCellMar>
-        </w:tblPrEx>
         <w:trPr>
           <w:cantSplit/>
         </w:trPr>
@@ -1495,7 +1476,7 @@
           <w:noProof/>
         </w:rPr>
         <w:drawing>
-          <wp:inline distT="0" distB="0" distL="0" distR="0" wp14:anchorId="1EFE4A3D" wp14:editId="6821D005">
+          <wp:inline distT="0" distB="0" distL="0" distR="0" wp14:anchorId="1EFE4A3D" wp14:editId="4A523CCA">
             <wp:extent cx="5731510" cy="3022600"/>
             <wp:effectExtent l="0" t="0" r="2540" b="6350"/>
             <wp:docPr id="2089684561" name="Picture 6"/>
@@ -1677,12 +1658,6 @@
         <w:gridCol w:w="2961"/>
       </w:tblGrid>
       <w:tr>
-        <w:tblPrEx>
-          <w:tblCellMar>
-            <w:top w:w="0" w:type="dxa"/>
-            <w:bottom w:w="0" w:type="dxa"/>
-          </w:tblCellMar>
-        </w:tblPrEx>
         <w:trPr>
           <w:cantSplit/>
         </w:trPr>
@@ -1793,12 +1768,6 @@
         </w:tc>
       </w:tr>
       <w:tr>
-        <w:tblPrEx>
-          <w:tblCellMar>
-            <w:top w:w="0" w:type="dxa"/>
-            <w:bottom w:w="0" w:type="dxa"/>
-          </w:tblCellMar>
-        </w:tblPrEx>
         <w:trPr>
           <w:cantSplit/>
         </w:trPr>
@@ -1901,12 +1870,6 @@
         </w:tc>
       </w:tr>
       <w:tr>
-        <w:tblPrEx>
-          <w:tblCellMar>
-            <w:top w:w="0" w:type="dxa"/>
-            <w:bottom w:w="0" w:type="dxa"/>
-          </w:tblCellMar>
-        </w:tblPrEx>
         <w:trPr>
           <w:cantSplit/>
         </w:trPr>
@@ -2009,12 +1972,6 @@
         </w:tc>
       </w:tr>
       <w:tr>
-        <w:tblPrEx>
-          <w:tblCellMar>
-            <w:top w:w="0" w:type="dxa"/>
-            <w:bottom w:w="0" w:type="dxa"/>
-          </w:tblCellMar>
-        </w:tblPrEx>
         <w:trPr>
           <w:cantSplit/>
         </w:trPr>
@@ -2117,12 +2074,6 @@
         </w:tc>
       </w:tr>
       <w:tr>
-        <w:tblPrEx>
-          <w:tblCellMar>
-            <w:top w:w="0" w:type="dxa"/>
-            <w:bottom w:w="0" w:type="dxa"/>
-          </w:tblCellMar>
-        </w:tblPrEx>
         <w:trPr>
           <w:cantSplit/>
         </w:trPr>
@@ -2225,12 +2176,6 @@
         </w:tc>
       </w:tr>
       <w:tr>
-        <w:tblPrEx>
-          <w:tblCellMar>
-            <w:top w:w="0" w:type="dxa"/>
-            <w:bottom w:w="0" w:type="dxa"/>
-          </w:tblCellMar>
-        </w:tblPrEx>
         <w:trPr>
           <w:cantSplit/>
         </w:trPr>
@@ -2837,12 +2782,6 @@
         <w:gridCol w:w="4500"/>
       </w:tblGrid>
       <w:tr>
-        <w:tblPrEx>
-          <w:tblCellMar>
-            <w:top w:w="0" w:type="dxa"/>
-            <w:bottom w:w="0" w:type="dxa"/>
-          </w:tblCellMar>
-        </w:tblPrEx>
         <w:trPr>
           <w:cantSplit/>
         </w:trPr>
@@ -2959,12 +2898,6 @@
         </w:tc>
       </w:tr>
       <w:tr>
-        <w:tblPrEx>
-          <w:tblCellMar>
-            <w:top w:w="0" w:type="dxa"/>
-            <w:bottom w:w="0" w:type="dxa"/>
-          </w:tblCellMar>
-        </w:tblPrEx>
         <w:trPr>
           <w:cantSplit/>
         </w:trPr>
@@ -3093,12 +3026,6 @@
         </w:tc>
       </w:tr>
       <w:tr>
-        <w:tblPrEx>
-          <w:tblCellMar>
-            <w:top w:w="0" w:type="dxa"/>
-            <w:bottom w:w="0" w:type="dxa"/>
-          </w:tblCellMar>
-        </w:tblPrEx>
         <w:trPr>
           <w:cantSplit/>
         </w:trPr>
@@ -3227,12 +3154,6 @@
         </w:tc>
       </w:tr>
       <w:tr>
-        <w:tblPrEx>
-          <w:tblCellMar>
-            <w:top w:w="0" w:type="dxa"/>
-            <w:bottom w:w="0" w:type="dxa"/>
-          </w:tblCellMar>
-        </w:tblPrEx>
         <w:trPr>
           <w:cantSplit/>
         </w:trPr>
@@ -3361,12 +3282,6 @@
         </w:tc>
       </w:tr>
       <w:tr>
-        <w:tblPrEx>
-          <w:tblCellMar>
-            <w:top w:w="0" w:type="dxa"/>
-            <w:bottom w:w="0" w:type="dxa"/>
-          </w:tblCellMar>
-        </w:tblPrEx>
         <w:trPr>
           <w:cantSplit/>
         </w:trPr>
@@ -3477,12 +3392,6 @@
         </w:tc>
       </w:tr>
       <w:tr>
-        <w:tblPrEx>
-          <w:tblCellMar>
-            <w:top w:w="0" w:type="dxa"/>
-            <w:bottom w:w="0" w:type="dxa"/>
-          </w:tblCellMar>
-        </w:tblPrEx>
         <w:trPr>
           <w:cantSplit/>
         </w:trPr>
@@ -3593,12 +3502,6 @@
         </w:tc>
       </w:tr>
       <w:tr>
-        <w:tblPrEx>
-          <w:tblCellMar>
-            <w:top w:w="0" w:type="dxa"/>
-            <w:bottom w:w="0" w:type="dxa"/>
-          </w:tblCellMar>
-        </w:tblPrEx>
         <w:trPr>
           <w:cantSplit/>
         </w:trPr>
@@ -4171,12 +4074,6 @@
         <w:gridCol w:w="4226"/>
       </w:tblGrid>
       <w:tr>
-        <w:tblPrEx>
-          <w:tblCellMar>
-            <w:top w:w="0" w:type="dxa"/>
-            <w:bottom w:w="0" w:type="dxa"/>
-          </w:tblCellMar>
-        </w:tblPrEx>
         <w:trPr>
           <w:cantSplit/>
         </w:trPr>
@@ -4330,12 +4227,6 @@
         </w:tc>
       </w:tr>
       <w:tr>
-        <w:tblPrEx>
-          <w:tblCellMar>
-            <w:top w:w="0" w:type="dxa"/>
-            <w:bottom w:w="0" w:type="dxa"/>
-          </w:tblCellMar>
-        </w:tblPrEx>
         <w:trPr>
           <w:cantSplit/>
         </w:trPr>
@@ -4499,12 +4390,6 @@
         </w:tc>
       </w:tr>
       <w:tr>
-        <w:tblPrEx>
-          <w:tblCellMar>
-            <w:top w:w="0" w:type="dxa"/>
-            <w:bottom w:w="0" w:type="dxa"/>
-          </w:tblCellMar>
-        </w:tblPrEx>
         <w:trPr>
           <w:cantSplit/>
         </w:trPr>
@@ -4668,12 +4553,6 @@
         </w:tc>
       </w:tr>
       <w:tr>
-        <w:tblPrEx>
-          <w:tblCellMar>
-            <w:top w:w="0" w:type="dxa"/>
-            <w:bottom w:w="0" w:type="dxa"/>
-          </w:tblCellMar>
-        </w:tblPrEx>
         <w:trPr>
           <w:cantSplit/>
         </w:trPr>
@@ -4837,12 +4716,6 @@
         </w:tc>
       </w:tr>
       <w:tr>
-        <w:tblPrEx>
-          <w:tblCellMar>
-            <w:top w:w="0" w:type="dxa"/>
-            <w:bottom w:w="0" w:type="dxa"/>
-          </w:tblCellMar>
-        </w:tblPrEx>
         <w:trPr>
           <w:cantSplit/>
         </w:trPr>
@@ -5636,31 +5509,7 @@
           <w:sz w:val="24"/>
           <w:szCs w:val="24"/>
         </w:rPr>
-        <w:t>Deliverable: Screenshots of successful registration, duplicate</w:t>
-      </w:r>
-      <w:r>
-        <w:rPr>
-          <w:rFonts w:ascii="Courier New" w:hAnsi="Courier New" w:cs="Courier New"/>
-          <w:b/>
-          <w:bCs/>
-          <w:i/>
-          <w:iCs/>
-          <w:sz w:val="24"/>
-          <w:szCs w:val="24"/>
-        </w:rPr>
-        <w:t xml:space="preserve"> email, mismatched password</w:t>
-      </w:r>
-      <w:r>
-        <w:rPr>
-          <w:rFonts w:ascii="Courier New" w:hAnsi="Courier New" w:cs="Courier New"/>
-          <w:b/>
-          <w:bCs/>
-          <w:i/>
-          <w:iCs/>
-          <w:sz w:val="24"/>
-          <w:szCs w:val="24"/>
-        </w:rPr>
-        <w:t>, and user dashboard</w:t>
+        <w:t>Deliverable: Screenshots of successful registration, duplicate email, mismatched password, and user dashboard</w:t>
       </w:r>
     </w:p>
     <w:p>
@@ -6222,7 +6071,7 @@
           <w:noProof/>
         </w:rPr>
         <w:drawing>
-          <wp:inline distT="0" distB="0" distL="0" distR="0" wp14:anchorId="5521F7B9" wp14:editId="1529F477">
+          <wp:inline distT="0" distB="0" distL="0" distR="0" wp14:anchorId="5521F7B9" wp14:editId="100FD45A">
             <wp:extent cx="5731510" cy="1525270"/>
             <wp:effectExtent l="0" t="0" r="2540" b="0"/>
             <wp:docPr id="1611173360" name="Picture 39"/>
@@ -6420,7 +6269,7 @@
           <w:noProof/>
         </w:rPr>
         <w:drawing>
-          <wp:inline distT="0" distB="0" distL="0" distR="0" wp14:anchorId="56C4F5B6" wp14:editId="73BFB473">
+          <wp:inline distT="0" distB="0" distL="0" distR="0" wp14:anchorId="56C4F5B6" wp14:editId="2510C986">
             <wp:extent cx="5731510" cy="1964055"/>
             <wp:effectExtent l="0" t="0" r="2540" b="0"/>
             <wp:docPr id="1434355612" name="Picture 42"/>
@@ -6973,8 +6822,9 @@
           <w:sz w:val="24"/>
           <w:szCs w:val="24"/>
         </w:rPr>
-        <w:t>self</w:t>
-      </w:r>
+        <w:t>self delete</w:t>
+      </w:r>
+      <w:proofErr w:type="spellEnd"/>
       <w:r>
         <w:rPr>
           <w:rFonts w:ascii="Courier New" w:hAnsi="Courier New" w:cs="Courier New"/>
@@ -6985,42 +6835,50 @@
           <w:sz w:val="24"/>
           <w:szCs w:val="24"/>
         </w:rPr>
-        <w:t xml:space="preserve"> </w:t>
-      </w:r>
+        <w:t>.</w:t>
+      </w:r>
+    </w:p>
+    <w:p>
+      <w:pPr>
+        <w:rPr>
+          <w:rFonts w:ascii="Courier New" w:hAnsi="Courier New" w:cs="Courier New"/>
+          <w:sz w:val="24"/>
+          <w:szCs w:val="24"/>
+        </w:rPr>
+      </w:pPr>
       <w:r>
         <w:rPr>
           <w:rFonts w:ascii="Courier New" w:hAnsi="Courier New" w:cs="Courier New"/>
           <w:b/>
           <w:bCs/>
-          <w:i/>
-          <w:iCs/>
-          <w:sz w:val="24"/>
-          <w:szCs w:val="24"/>
-        </w:rPr>
-        <w:t>delete</w:t>
-      </w:r>
-      <w:proofErr w:type="spellEnd"/>
+          <w:sz w:val="24"/>
+          <w:szCs w:val="24"/>
+        </w:rPr>
+        <w:lastRenderedPageBreak/>
+        <w:t>Task 10 — Reflection Questions (10 pts)</w:t>
+      </w:r>
+    </w:p>
+    <w:p>
+      <w:pPr>
+        <w:keepNext/>
+        <w:spacing w:before="100" w:after="100"/>
+        <w:rPr>
+          <w:rFonts w:ascii="Courier New" w:hAnsi="Courier New" w:cs="Courier New"/>
+          <w:sz w:val="24"/>
+          <w:szCs w:val="24"/>
+        </w:rPr>
+      </w:pPr>
       <w:r>
         <w:rPr>
           <w:rFonts w:ascii="Courier New" w:hAnsi="Courier New" w:cs="Courier New"/>
           <w:b/>
           <w:bCs/>
-          <w:i/>
-          <w:iCs/>
-          <w:sz w:val="24"/>
-          <w:szCs w:val="24"/>
-        </w:rPr>
-        <w:t>.</w:t>
-      </w:r>
-    </w:p>
-    <w:p>
-      <w:pPr>
-        <w:rPr>
-          <w:rFonts w:ascii="Courier New" w:hAnsi="Courier New" w:cs="Courier New"/>
-          <w:sz w:val="24"/>
-          <w:szCs w:val="24"/>
-        </w:rPr>
-      </w:pPr>
+          <w:sz w:val="24"/>
+          <w:szCs w:val="24"/>
+        </w:rPr>
+        <w:t xml:space="preserve">Q1. In server.js, paste the exact block that decides </w:t>
+      </w:r>
+      <w:proofErr w:type="spellStart"/>
       <w:r>
         <w:rPr>
           <w:rFonts w:ascii="Courier New" w:hAnsi="Courier New" w:cs="Courier New"/>
@@ -7029,20 +6887,9 @@
           <w:sz w:val="24"/>
           <w:szCs w:val="24"/>
         </w:rPr>
-        <w:lastRenderedPageBreak/>
-        <w:t>Task 10 — Reflection Questions (10 pts)</w:t>
-      </w:r>
-    </w:p>
-    <w:p>
-      <w:pPr>
-        <w:keepNext/>
-        <w:spacing w:before="100" w:after="100"/>
-        <w:rPr>
-          <w:rFonts w:ascii="Courier New" w:hAnsi="Courier New" w:cs="Courier New"/>
-          <w:sz w:val="24"/>
-          <w:szCs w:val="24"/>
-        </w:rPr>
-      </w:pPr>
+        <w:t>redirectTo</w:t>
+      </w:r>
+      <w:proofErr w:type="spellEnd"/>
       <w:r>
         <w:rPr>
           <w:rFonts w:ascii="Courier New" w:hAnsi="Courier New" w:cs="Courier New"/>
@@ -7051,28 +6898,6 @@
           <w:sz w:val="24"/>
           <w:szCs w:val="24"/>
         </w:rPr>
-        <w:t xml:space="preserve">Q1. In server.js, paste the exact block that decides </w:t>
-      </w:r>
-      <w:proofErr w:type="spellStart"/>
-      <w:r>
-        <w:rPr>
-          <w:rFonts w:ascii="Courier New" w:hAnsi="Courier New" w:cs="Courier New"/>
-          <w:b/>
-          <w:bCs/>
-          <w:sz w:val="24"/>
-          <w:szCs w:val="24"/>
-        </w:rPr>
-        <w:t>redirectTo</w:t>
-      </w:r>
-      <w:proofErr w:type="spellEnd"/>
-      <w:r>
-        <w:rPr>
-          <w:rFonts w:ascii="Courier New" w:hAnsi="Courier New" w:cs="Courier New"/>
-          <w:b/>
-          <w:bCs/>
-          <w:sz w:val="24"/>
-          <w:szCs w:val="24"/>
-        </w:rPr>
         <w:t>.</w:t>
       </w:r>
     </w:p>
@@ -7132,6 +6957,7 @@
         <w:t>if (</w:t>
       </w:r>
       <w:proofErr w:type="spellStart"/>
+      <w:proofErr w:type="gramStart"/>
       <w:r>
         <w:rPr>
           <w:rFonts w:ascii="Courier New" w:eastAsia="Courier New" w:hAnsi="Courier New" w:cs="Courier New"/>
@@ -7141,6 +6967,7 @@
         <w:t>user.role</w:t>
       </w:r>
       <w:proofErr w:type="spellEnd"/>
+      <w:proofErr w:type="gramEnd"/>
       <w:r>
         <w:rPr>
           <w:rFonts w:ascii="Courier New" w:eastAsia="Courier New" w:hAnsi="Courier New" w:cs="Courier New"/>
@@ -7187,6 +7014,7 @@
         <w:t>else if (</w:t>
       </w:r>
       <w:proofErr w:type="spellStart"/>
+      <w:proofErr w:type="gramStart"/>
       <w:r>
         <w:rPr>
           <w:rFonts w:ascii="Courier New" w:eastAsia="Courier New" w:hAnsi="Courier New" w:cs="Courier New"/>
@@ -7196,6 +7024,7 @@
         <w:t>user.role</w:t>
       </w:r>
       <w:proofErr w:type="spellEnd"/>
+      <w:proofErr w:type="gramEnd"/>
       <w:r>
         <w:rPr>
           <w:rFonts w:ascii="Courier New" w:eastAsia="Courier New" w:hAnsi="Courier New" w:cs="Courier New"/>
@@ -7739,7 +7568,25 @@
           <w:sz w:val="24"/>
           <w:szCs w:val="24"/>
         </w:rPr>
-        <w:t>They are all lost, because they are only stored in the users array in memory.</w:t>
+        <w:t xml:space="preserve">They are all lost, because they are only stored in the </w:t>
+      </w:r>
+      <w:proofErr w:type="gramStart"/>
+      <w:r>
+        <w:rPr>
+          <w:rFonts w:ascii="Courier New" w:hAnsi="Courier New" w:cs="Courier New"/>
+          <w:sz w:val="24"/>
+          <w:szCs w:val="24"/>
+        </w:rPr>
+        <w:t>users</w:t>
+      </w:r>
+      <w:proofErr w:type="gramEnd"/>
+      <w:r>
+        <w:rPr>
+          <w:rFonts w:ascii="Courier New" w:hAnsi="Courier New" w:cs="Courier New"/>
+          <w:sz w:val="24"/>
+          <w:szCs w:val="24"/>
+        </w:rPr>
+        <w:t xml:space="preserve"> array in memory.</w:t>
       </w:r>
     </w:p>
     <w:p>
@@ -8091,7 +7938,25 @@
           <w:sz w:val="24"/>
           <w:szCs w:val="24"/>
         </w:rPr>
-        <w:t>Right now passwords are stored in plain text and the role checks are only in the browser. Hashing protects passwords if the data leaks, and server-side checks make sure that people cannot fake being an admin.</w:t>
+        <w:t xml:space="preserve">Right </w:t>
+      </w:r>
+      <w:proofErr w:type="gramStart"/>
+      <w:r>
+        <w:rPr>
+          <w:rFonts w:ascii="Courier New" w:hAnsi="Courier New" w:cs="Courier New"/>
+          <w:sz w:val="24"/>
+          <w:szCs w:val="24"/>
+        </w:rPr>
+        <w:t>now</w:t>
+      </w:r>
+      <w:proofErr w:type="gramEnd"/>
+      <w:r>
+        <w:rPr>
+          <w:rFonts w:ascii="Courier New" w:hAnsi="Courier New" w:cs="Courier New"/>
+          <w:sz w:val="24"/>
+          <w:szCs w:val="24"/>
+        </w:rPr>
+        <w:t xml:space="preserve"> passwords are stored in plain text and the role checks are only in the browser. Hashing protects passwords if the data leaks, and server-side checks make sure that people cannot fake being an admin.</w:t>
       </w:r>
     </w:p>
     <w:p>
@@ -8155,12 +8020,6 @@
         <w:gridCol w:w="897"/>
       </w:tblGrid>
       <w:tr>
-        <w:tblPrEx>
-          <w:tblCellMar>
-            <w:top w:w="0" w:type="dxa"/>
-            <w:bottom w:w="0" w:type="dxa"/>
-          </w:tblCellMar>
-        </w:tblPrEx>
         <w:trPr>
           <w:cantSplit/>
         </w:trPr>
@@ -8314,12 +8173,6 @@
         </w:tc>
       </w:tr>
       <w:tr>
-        <w:tblPrEx>
-          <w:tblCellMar>
-            <w:top w:w="0" w:type="dxa"/>
-            <w:bottom w:w="0" w:type="dxa"/>
-          </w:tblCellMar>
-        </w:tblPrEx>
         <w:trPr>
           <w:cantSplit/>
         </w:trPr>
@@ -8462,12 +8315,6 @@
         </w:tc>
       </w:tr>
       <w:tr>
-        <w:tblPrEx>
-          <w:tblCellMar>
-            <w:top w:w="0" w:type="dxa"/>
-            <w:bottom w:w="0" w:type="dxa"/>
-          </w:tblCellMar>
-        </w:tblPrEx>
         <w:trPr>
           <w:cantSplit/>
         </w:trPr>
@@ -8610,12 +8457,6 @@
         </w:tc>
       </w:tr>
       <w:tr>
-        <w:tblPrEx>
-          <w:tblCellMar>
-            <w:top w:w="0" w:type="dxa"/>
-            <w:bottom w:w="0" w:type="dxa"/>
-          </w:tblCellMar>
-        </w:tblPrEx>
         <w:trPr>
           <w:cantSplit/>
         </w:trPr>
@@ -8758,12 +8599,6 @@
         </w:tc>
       </w:tr>
       <w:tr>
-        <w:tblPrEx>
-          <w:tblCellMar>
-            <w:top w:w="0" w:type="dxa"/>
-            <w:bottom w:w="0" w:type="dxa"/>
-          </w:tblCellMar>
-        </w:tblPrEx>
         <w:trPr>
           <w:cantSplit/>
         </w:trPr>
@@ -8924,12 +8759,6 @@
         </w:tc>
       </w:tr>
       <w:tr>
-        <w:tblPrEx>
-          <w:tblCellMar>
-            <w:top w:w="0" w:type="dxa"/>
-            <w:bottom w:w="0" w:type="dxa"/>
-          </w:tblCellMar>
-        </w:tblPrEx>
         <w:trPr>
           <w:cantSplit/>
         </w:trPr>
@@ -9090,12 +8919,6 @@
         </w:tc>
       </w:tr>
       <w:tr>
-        <w:tblPrEx>
-          <w:tblCellMar>
-            <w:top w:w="0" w:type="dxa"/>
-            <w:bottom w:w="0" w:type="dxa"/>
-          </w:tblCellMar>
-        </w:tblPrEx>
         <w:trPr>
           <w:cantSplit/>
         </w:trPr>
@@ -9256,12 +9079,6 @@
         </w:tc>
       </w:tr>
       <w:tr>
-        <w:tblPrEx>
-          <w:tblCellMar>
-            <w:top w:w="0" w:type="dxa"/>
-            <w:bottom w:w="0" w:type="dxa"/>
-          </w:tblCellMar>
-        </w:tblPrEx>
         <w:trPr>
           <w:cantSplit/>
         </w:trPr>
@@ -9422,12 +9239,6 @@
         </w:tc>
       </w:tr>
       <w:tr>
-        <w:tblPrEx>
-          <w:tblCellMar>
-            <w:top w:w="0" w:type="dxa"/>
-            <w:bottom w:w="0" w:type="dxa"/>
-          </w:tblCellMar>
-        </w:tblPrEx>
         <w:trPr>
           <w:cantSplit/>
         </w:trPr>
@@ -9588,12 +9399,6 @@
         </w:tc>
       </w:tr>
       <w:tr>
-        <w:tblPrEx>
-          <w:tblCellMar>
-            <w:top w:w="0" w:type="dxa"/>
-            <w:bottom w:w="0" w:type="dxa"/>
-          </w:tblCellMar>
-        </w:tblPrEx>
         <w:trPr>
           <w:cantSplit/>
         </w:trPr>
@@ -9754,12 +9559,6 @@
         </w:tc>
       </w:tr>
       <w:tr>
-        <w:tblPrEx>
-          <w:tblCellMar>
-            <w:top w:w="0" w:type="dxa"/>
-            <w:bottom w:w="0" w:type="dxa"/>
-          </w:tblCellMar>
-        </w:tblPrEx>
         <w:trPr>
           <w:cantSplit/>
         </w:trPr>
@@ -9920,12 +9719,6 @@
         </w:tc>
       </w:tr>
       <w:tr>
-        <w:tblPrEx>
-          <w:tblCellMar>
-            <w:top w:w="0" w:type="dxa"/>
-            <w:bottom w:w="0" w:type="dxa"/>
-          </w:tblCellMar>
-        </w:tblPrEx>
         <w:trPr>
           <w:cantSplit/>
         </w:trPr>
@@ -10086,12 +9879,6 @@
         </w:tc>
       </w:tr>
       <w:tr>
-        <w:tblPrEx>
-          <w:tblCellMar>
-            <w:top w:w="0" w:type="dxa"/>
-            <w:bottom w:w="0" w:type="dxa"/>
-          </w:tblCellMar>
-        </w:tblPrEx>
         <w:trPr>
           <w:cantSplit/>
         </w:trPr>
@@ -10252,12 +10039,6 @@
         </w:tc>
       </w:tr>
       <w:tr>
-        <w:tblPrEx>
-          <w:tblCellMar>
-            <w:top w:w="0" w:type="dxa"/>
-            <w:bottom w:w="0" w:type="dxa"/>
-          </w:tblCellMar>
-        </w:tblPrEx>
         <w:trPr>
           <w:cantSplit/>
         </w:trPr>
@@ -10436,12 +10217,6 @@
         </w:tc>
       </w:tr>
       <w:tr>
-        <w:tblPrEx>
-          <w:tblCellMar>
-            <w:top w:w="0" w:type="dxa"/>
-            <w:bottom w:w="0" w:type="dxa"/>
-          </w:tblCellMar>
-        </w:tblPrEx>
         <w:trPr>
           <w:cantSplit/>
         </w:trPr>
@@ -10620,12 +10395,6 @@
         </w:tc>
       </w:tr>
       <w:tr>
-        <w:tblPrEx>
-          <w:tblCellMar>
-            <w:top w:w="0" w:type="dxa"/>
-            <w:bottom w:w="0" w:type="dxa"/>
-          </w:tblCellMar>
-        </w:tblPrEx>
         <w:trPr>
           <w:cantSplit/>
         </w:trPr>
@@ -10804,12 +10573,6 @@
         </w:tc>
       </w:tr>
       <w:tr>
-        <w:tblPrEx>
-          <w:tblCellMar>
-            <w:top w:w="0" w:type="dxa"/>
-            <w:bottom w:w="0" w:type="dxa"/>
-          </w:tblCellMar>
-        </w:tblPrEx>
         <w:trPr>
           <w:cantSplit/>
         </w:trPr>
@@ -10970,12 +10733,6 @@
         </w:tc>
       </w:tr>
       <w:tr>
-        <w:tblPrEx>
-          <w:tblCellMar>
-            <w:top w:w="0" w:type="dxa"/>
-            <w:bottom w:w="0" w:type="dxa"/>
-          </w:tblCellMar>
-        </w:tblPrEx>
         <w:trPr>
           <w:cantSplit/>
         </w:trPr>
@@ -11136,12 +10893,6 @@
         </w:tc>
       </w:tr>
       <w:tr>
-        <w:tblPrEx>
-          <w:tblCellMar>
-            <w:top w:w="0" w:type="dxa"/>
-            <w:bottom w:w="0" w:type="dxa"/>
-          </w:tblCellMar>
-        </w:tblPrEx>
         <w:trPr>
           <w:cantSplit/>
         </w:trPr>
@@ -11302,12 +11053,6 @@
         </w:tc>
       </w:tr>
       <w:tr>
-        <w:tblPrEx>
-          <w:tblCellMar>
-            <w:top w:w="0" w:type="dxa"/>
-            <w:bottom w:w="0" w:type="dxa"/>
-          </w:tblCellMar>
-        </w:tblPrEx>
         <w:trPr>
           <w:cantSplit/>
         </w:trPr>
@@ -11450,12 +11195,6 @@
         </w:tc>
       </w:tr>
       <w:tr>
-        <w:tblPrEx>
-          <w:tblCellMar>
-            <w:top w:w="0" w:type="dxa"/>
-            <w:bottom w:w="0" w:type="dxa"/>
-          </w:tblCellMar>
-        </w:tblPrEx>
         <w:trPr>
           <w:cantSplit/>
         </w:trPr>
@@ -11598,12 +11337,6 @@
         </w:tc>
       </w:tr>
       <w:tr>
-        <w:tblPrEx>
-          <w:tblCellMar>
-            <w:top w:w="0" w:type="dxa"/>
-            <w:bottom w:w="0" w:type="dxa"/>
-          </w:tblCellMar>
-        </w:tblPrEx>
         <w:trPr>
           <w:cantSplit/>
         </w:trPr>
@@ -11747,12 +11480,6 @@
         </w:tc>
       </w:tr>
       <w:tr>
-        <w:tblPrEx>
-          <w:tblCellMar>
-            <w:top w:w="0" w:type="dxa"/>
-            <w:bottom w:w="0" w:type="dxa"/>
-          </w:tblCellMar>
-        </w:tblPrEx>
         <w:trPr>
           <w:cantSplit/>
         </w:trPr>
@@ -11895,12 +11622,6 @@
         </w:tc>
       </w:tr>
       <w:tr>
-        <w:tblPrEx>
-          <w:tblCellMar>
-            <w:top w:w="0" w:type="dxa"/>
-            <w:bottom w:w="0" w:type="dxa"/>
-          </w:tblCellMar>
-        </w:tblPrEx>
         <w:trPr>
           <w:cantSplit/>
         </w:trPr>
@@ -12053,12 +11774,6 @@
         </w:tc>
       </w:tr>
       <w:tr>
-        <w:tblPrEx>
-          <w:tblCellMar>
-            <w:top w:w="0" w:type="dxa"/>
-            <w:bottom w:w="0" w:type="dxa"/>
-          </w:tblCellMar>
-        </w:tblPrEx>
         <w:trPr>
           <w:cantSplit/>
         </w:trPr>
@@ -12201,12 +11916,6 @@
         </w:tc>
       </w:tr>
       <w:tr>
-        <w:tblPrEx>
-          <w:tblCellMar>
-            <w:top w:w="0" w:type="dxa"/>
-            <w:bottom w:w="0" w:type="dxa"/>
-          </w:tblCellMar>
-        </w:tblPrEx>
         <w:trPr>
           <w:cantSplit/>
         </w:trPr>
@@ -12367,12 +12076,6 @@
         </w:tc>
       </w:tr>
       <w:tr>
-        <w:tblPrEx>
-          <w:tblCellMar>
-            <w:top w:w="0" w:type="dxa"/>
-            <w:bottom w:w="0" w:type="dxa"/>
-          </w:tblCellMar>
-        </w:tblPrEx>
         <w:trPr>
           <w:cantSplit/>
         </w:trPr>
@@ -12515,12 +12218,6 @@
         </w:tc>
       </w:tr>
       <w:tr>
-        <w:tblPrEx>
-          <w:tblCellMar>
-            <w:top w:w="0" w:type="dxa"/>
-            <w:bottom w:w="0" w:type="dxa"/>
-          </w:tblCellMar>
-        </w:tblPrEx>
         <w:trPr>
           <w:cantSplit/>
         </w:trPr>
@@ -12663,12 +12360,6 @@
         </w:tc>
       </w:tr>
       <w:tr>
-        <w:tblPrEx>
-          <w:tblCellMar>
-            <w:top w:w="0" w:type="dxa"/>
-            <w:bottom w:w="0" w:type="dxa"/>
-          </w:tblCellMar>
-        </w:tblPrEx>
         <w:trPr>
           <w:cantSplit/>
         </w:trPr>
@@ -12811,12 +12502,6 @@
         </w:tc>
       </w:tr>
       <w:tr>
-        <w:tblPrEx>
-          <w:tblCellMar>
-            <w:top w:w="0" w:type="dxa"/>
-            <w:bottom w:w="0" w:type="dxa"/>
-          </w:tblCellMar>
-        </w:tblPrEx>
         <w:trPr>
           <w:cantSplit/>
         </w:trPr>
@@ -12959,12 +12644,6 @@
         </w:tc>
       </w:tr>
       <w:tr>
-        <w:tblPrEx>
-          <w:tblCellMar>
-            <w:top w:w="0" w:type="dxa"/>
-            <w:bottom w:w="0" w:type="dxa"/>
-          </w:tblCellMar>
-        </w:tblPrEx>
         <w:trPr>
           <w:cantSplit/>
         </w:trPr>
@@ -13107,12 +12786,6 @@
         </w:tc>
       </w:tr>
       <w:tr>
-        <w:tblPrEx>
-          <w:tblCellMar>
-            <w:top w:w="0" w:type="dxa"/>
-            <w:bottom w:w="0" w:type="dxa"/>
-          </w:tblCellMar>
-        </w:tblPrEx>
         <w:trPr>
           <w:cantSplit/>
         </w:trPr>
@@ -13255,12 +12928,6 @@
         </w:tc>
       </w:tr>
       <w:tr>
-        <w:tblPrEx>
-          <w:tblCellMar>
-            <w:top w:w="0" w:type="dxa"/>
-            <w:bottom w:w="0" w:type="dxa"/>
-          </w:tblCellMar>
-        </w:tblPrEx>
         <w:trPr>
           <w:cantSplit/>
         </w:trPr>
@@ -13403,12 +13070,6 @@
         </w:tc>
       </w:tr>
       <w:tr>
-        <w:tblPrEx>
-          <w:tblCellMar>
-            <w:top w:w="0" w:type="dxa"/>
-            <w:bottom w:w="0" w:type="dxa"/>
-          </w:tblCellMar>
-        </w:tblPrEx>
         <w:trPr>
           <w:cantSplit/>
         </w:trPr>
@@ -13706,6 +13367,7 @@
         <w:t xml:space="preserve">/profile/:id). Login and the current-password check now use </w:t>
       </w:r>
       <w:proofErr w:type="spellStart"/>
+      <w:proofErr w:type="gramStart"/>
       <w:r>
         <w:rPr>
           <w:rFonts w:ascii="Courier New" w:hAnsi="Courier New" w:cs="Courier New"/>
@@ -13715,6 +13377,7 @@
         <w:t>bcrypt.compare</w:t>
       </w:r>
       <w:proofErr w:type="spellEnd"/>
+      <w:proofErr w:type="gramEnd"/>
       <w:r>
         <w:rPr>
           <w:rFonts w:ascii="Courier New" w:hAnsi="Courier New" w:cs="Courier New"/>
@@ -13765,6 +13428,7 @@
         <w:t xml:space="preserve">const hashed = await </w:t>
       </w:r>
       <w:proofErr w:type="spellStart"/>
+      <w:proofErr w:type="gramStart"/>
       <w:r>
         <w:rPr>
           <w:rFonts w:ascii="Courier New" w:eastAsia="Courier New" w:hAnsi="Courier New" w:cs="Courier New"/>
@@ -13772,6 +13436,7 @@
         <w:t>bcrypt.hash</w:t>
       </w:r>
       <w:proofErr w:type="spellEnd"/>
+      <w:proofErr w:type="gramEnd"/>
       <w:r>
         <w:rPr>
           <w:rFonts w:ascii="Courier New" w:eastAsia="Courier New" w:hAnsi="Courier New" w:cs="Courier New"/>
@@ -13796,6 +13461,7 @@
         <w:t xml:space="preserve">const match = await </w:t>
       </w:r>
       <w:proofErr w:type="spellStart"/>
+      <w:proofErr w:type="gramStart"/>
       <w:r>
         <w:rPr>
           <w:rFonts w:ascii="Courier New" w:eastAsia="Courier New" w:hAnsi="Courier New" w:cs="Courier New"/>
@@ -13803,6 +13469,7 @@
         <w:t>bcrypt.compare</w:t>
       </w:r>
       <w:proofErr w:type="spellEnd"/>
+      <w:proofErr w:type="gramEnd"/>
       <w:r>
         <w:rPr>
           <w:rFonts w:ascii="Courier New" w:eastAsia="Courier New" w:hAnsi="Courier New" w:cs="Courier New"/>
@@ -13810,6 +13477,7 @@
         <w:t xml:space="preserve">(password, </w:t>
       </w:r>
       <w:proofErr w:type="spellStart"/>
+      <w:proofErr w:type="gramStart"/>
       <w:r>
         <w:rPr>
           <w:rFonts w:ascii="Courier New" w:eastAsia="Courier New" w:hAnsi="Courier New" w:cs="Courier New"/>
@@ -13817,6 +13485,7 @@
         <w:t>user.password</w:t>
       </w:r>
       <w:proofErr w:type="spellEnd"/>
+      <w:proofErr w:type="gramEnd"/>
       <w:r>
         <w:rPr>
           <w:rFonts w:ascii="Courier New" w:eastAsia="Courier New" w:hAnsi="Courier New" w:cs="Courier New"/>
@@ -13847,7 +13516,7 @@
           <w:noProof/>
         </w:rPr>
         <w:drawing>
-          <wp:inline distT="0" distB="0" distL="0" distR="0" wp14:anchorId="733C8099" wp14:editId="026937F5">
+          <wp:inline distT="0" distB="0" distL="0" distR="0" wp14:anchorId="733C8099" wp14:editId="6FDDA506">
             <wp:extent cx="5731510" cy="2950210"/>
             <wp:effectExtent l="0" t="0" r="2540" b="2540"/>
             <wp:docPr id="1457477014" name="Picture 54"/>
@@ -13908,7 +13577,7 @@
           <w:noProof/>
         </w:rPr>
         <w:drawing>
-          <wp:inline distT="0" distB="0" distL="0" distR="0" wp14:anchorId="40888E72" wp14:editId="15F5667B">
+          <wp:inline distT="0" distB="0" distL="0" distR="0" wp14:anchorId="40888E72" wp14:editId="1FF75DFE">
             <wp:extent cx="5731510" cy="3048000"/>
             <wp:effectExtent l="0" t="0" r="2540" b="0"/>
             <wp:docPr id="2130192364" name="Picture 55"/>
@@ -14226,6 +13895,7 @@
         <w:t xml:space="preserve">, replaced the plain-text password checks with </w:t>
       </w:r>
       <w:proofErr w:type="spellStart"/>
+      <w:proofErr w:type="gramStart"/>
       <w:r>
         <w:rPr>
           <w:rFonts w:ascii="Courier New" w:hAnsi="Courier New" w:cs="Courier New"/>
@@ -14235,6 +13905,7 @@
         <w:t>bcrypt.hash</w:t>
       </w:r>
       <w:proofErr w:type="spellEnd"/>
+      <w:proofErr w:type="gramEnd"/>
       <w:r>
         <w:rPr>
           <w:rFonts w:ascii="Courier New" w:hAnsi="Courier New" w:cs="Courier New"/>
@@ -14244,6 +13915,7 @@
         <w:t xml:space="preserve"> and </w:t>
       </w:r>
       <w:proofErr w:type="spellStart"/>
+      <w:proofErr w:type="gramStart"/>
       <w:r>
         <w:rPr>
           <w:rFonts w:ascii="Courier New" w:hAnsi="Courier New" w:cs="Courier New"/>
@@ -14253,6 +13925,7 @@
         <w:t>bcrypt.compare</w:t>
       </w:r>
       <w:proofErr w:type="spellEnd"/>
+      <w:proofErr w:type="gramEnd"/>
       <w:r>
         <w:rPr>
           <w:rFonts w:ascii="Courier New" w:hAnsi="Courier New" w:cs="Courier New"/>
@@ -14970,6 +14643,7 @@
   <w:style w:type="character" w:default="1" w:styleId="DefaultParagraphFont">
     <w:name w:val="Default Paragraph Font"/>
     <w:uiPriority w:val="1"/>
+    <w:semiHidden/>
     <w:unhideWhenUsed/>
   </w:style>
   <w:style w:type="table" w:default="1" w:styleId="TableNormal">

</xml_diff>